<commit_message>
State what the coverage words mean in every report so Full, Partial, Direct, and Out of scope are not read as a pass.
Co-authored-by: Cursor <cursoragent@cursor.com>
</commit_message>
<xml_diff>
--- a/APRA-CPS-234/CSW-APRA-CPS234-Compliance-Report.docx
+++ b/APRA-CPS-234/CSW-APRA-CPS234-Compliance-Report.docx
@@ -171,6 +171,62 @@
     </w:p>
     <w:bookmarkEnd w:id="11"/>
     <w:bookmarkStart w:id="12" w:name="executive-summary"/>
+    <w:p>
+      <w:pPr>
+        <w:pStyle w:val="Heading2"/>
+      </w:pPr>
+      <w:r>
+        <w:t>How to read the coverage words</w:t>
+      </w:r>
+    </w:p>
+    <w:p>
+      <w:pPr/>
+      <w:r>
+        <w:rPr>
+          <w:b/>
+        </w:rPr>
+        <w:t>Full Coverage</w:t>
+      </w:r>
+      <w:r>
+        <w:t xml:space="preserve"> on the older reports means Secure Workload can produce that row's artifact. It does not mean the control is met.</w:t>
+      </w:r>
+    </w:p>
+    <w:p>
+      <w:pPr/>
+      <w:r>
+        <w:rPr>
+          <w:b/>
+        </w:rPr>
+        <w:t>Partial Coverage</w:t>
+      </w:r>
+      <w:r>
+        <w:t xml:space="preserve"> means file that export next to another control.</w:t>
+      </w:r>
+    </w:p>
+    <w:p>
+      <w:pPr/>
+      <w:r>
+        <w:rPr>
+          <w:b/>
+        </w:rPr>
+        <w:t>Evidence Required</w:t>
+      </w:r>
+      <w:r>
+        <w:t xml:space="preserve"> means Secure Workload has no record. The customer files the contract, the analysis, or the HR or physical-security evidence.</w:t>
+      </w:r>
+    </w:p>
+    <w:p>
+      <w:pPr/>
+      <w:r>
+        <w:rPr>
+          <w:b/>
+        </w:rPr>
+        <w:t>Direct, Supporting, and Out of scope</w:t>
+      </w:r>
+      <w:r>
+        <w:t xml:space="preserve"> on the newer reports are the same idea in different words. Direct is still evidence, not a pass.</w:t>
+      </w:r>
+    </w:p>
     <w:p>
       <w:pPr>
         <w:pStyle w:val="Heading2"/>

</xml_diff>

<commit_message>
Rebuild HTML/DOCX/PDF for reference-design terminology; fix build-html titles, index labels, and cross-link targets
Co-authored-by: Cursor <cursoragent@cursor.com>
</commit_message>
<xml_diff>
--- a/APRA-CPS-234/CSW-APRA-CPS234-Compliance-Report.docx
+++ b/APRA-CPS-234/CSW-APRA-CPS234-Compliance-Report.docx
@@ -150,13 +150,13 @@
         <w:t xml:space="preserve"> </w:t>
       </w:r>
       <w:r>
-        <w:t xml:space="preserve">they produce. The technical runbook (</w:t>
+        <w:t xml:space="preserve">they produce. The reference design (</w:t>
       </w:r>
       <w:r>
         <w:rPr>
           <w:rStyle w:val="VerbatimChar"/>
         </w:rPr>
-        <w:t xml:space="preserve">CSW-APRA-CPS234-Technical-Runbook.md</w:t>
+        <w:t xml:space="preserve">CSW-APRA-CPS234-Technical-Reference design.md</w:t>
       </w:r>
       <w:r>
         <w:t xml:space="preserve">) in this folder contains the deeper engineering detail.</w:t>

</xml_diff>